<commit_message>
Correct ADR similarity classifications and source controls
</commit_message>
<xml_diff>
--- a/report/adr2_side_door_similarity_supplement.docx
+++ b/report/adr2_side_door_similarity_supplement.docx
@@ -42,7 +42,7 @@
         <w:pStyle w:val="ListBullet"/>
       </w:pPr>
       <w:r>
-        <w:t>**PASS — functional similarity:** all 12 screened Challenger/Charger variant-pair combinations contain corresponding left/right front-door latch architecture; lower left/right hinge pairs were also identified by OEM part listings.</w:t>
+        <w:t>PASS — functional similarity: all 12 screened Challenger/Charger variant-pair combinations contain corresponding left/right front-door latch architecture; lower left/right hinge pairs were identified from genuine-Mopar parts retailer fitment listings.</w:t>
       </w:r>
     </w:p>
     <w:p>
@@ -50,7 +50,7 @@
         <w:pStyle w:val="ListBullet"/>
       </w:pPr>
       <w:r>
-        <w:t>**VERIFIED:** 613 front-door catalog rows, 52 direct latch/attaching-hardware rows, 21 exploded-diagram records and zero scraper errors.</w:t>
+        <w:t>VERIFIED: 613 front-door catalog rows, 52 direct latch/attaching-hardware rows, 21 exploded-diagram records and zero scraper errors.</w:t>
       </w:r>
     </w:p>
     <w:p>
@@ -58,7 +58,7 @@
         <w:pStyle w:val="ListBullet"/>
       </w:pPr>
       <w:r>
-        <w:t>**VERIFIED:** 26 exact shared exterior-handle part numbers support common door-control architecture.</w:t>
+        <w:t>VERIFIED: 26 exact shared exterior-handle part numbers show ancillary door-control commonality only; they do not support latch/hinge identity or performance.</w:t>
       </w:r>
     </w:p>
     <w:p>
@@ -66,7 +66,7 @@
         <w:pStyle w:val="ListBullet"/>
       </w:pPr>
       <w:r>
-        <w:t>**LIMIT:** no exact common OEM service part number was established for the core Challenger-versus-Charger latch or lower-hinge assemblies. The coupes and sedans use different core service numbers.</w:t>
+        <w:t>LIMIT: no exact common OEM service part number was established for the core Challenger-versus-Charger latch or lower-hinge assemblies. The coupes and sedans use different core service numbers.</w:t>
       </w:r>
     </w:p>
     <w:p>
@@ -74,7 +74,7 @@
         <w:pStyle w:val="ListBullet"/>
       </w:pPr>
       <w:r>
-        <w:t>**ADR LIMIT:** this supports an ADR 2/01 component-architecture similarity argument only. It does not prove latch/hinge strength, longitudinal/transverse load performance, installed configuration, or ADR compliance.</w:t>
+        <w:t>ADR LIMIT: this supports an ADR 2/01 component-architecture similarity argument only. It does not prove latch/hinge strength, longitudinal/transverse load performance, installed configuration, or ADR compliance.</w:t>
       </w:r>
     </w:p>
     <w:p>
@@ -367,7 +367,7 @@
               <w:rPr>
                 <w:sz w:val="12"/>
               </w:rPr>
-              <w:t>same OEM component class, side and lower-hinge function; different service part number</w:t>
+              <w:t>same genuine-Mopar component class, side and lower-hinge function from retailer fitment listings; different service part number</w:t>
             </w:r>
           </w:p>
         </w:tc>
@@ -434,7 +434,7 @@
               <w:rPr>
                 <w:sz w:val="12"/>
               </w:rPr>
-              <w:t>same OEM component class, side and lower-hinge function; different service part number</w:t>
+              <w:t>same genuine-Mopar component class, side and lower-hinge function from retailer fitment listings; different service part number</w:t>
             </w:r>
           </w:p>
         </w:tc>
@@ -1362,7 +1362,7 @@
     </w:p>
     <w:p>
       <w:r>
-        <w:t>Exterior-handle/door-control parts; not latch/hinge retention components.</w:t>
+        <w:t>Ancillary exterior-handle/door-control commonality only; not latch/hinge retention components or performance evidence.</w:t>
       </w:r>
     </w:p>
     <w:tbl>
@@ -3171,7 +3171,7 @@
     </w:p>
     <w:p>
       <w:r>
-        <w:t>**Broad-criterion result: PASS.** Challenger and Charger variants demonstrate corresponding front-door latch and lower-hinge architecture, and 26 exact common exterior-handle service numbers support shared door-control design. The core latch and lower-hinge service numbers differ, so the evidence must be described as functional/component-class similarity—not exact latch/hinge identity and not ADR 2/01 compliance.</w:t>
+        <w:t>Broad-criterion result: PASS. Challenger and Charger variants demonstrate corresponding front-door latch and lower-hinge component classes. The 26 exact common exterior-handle service numbers show ancillary door-control commonality only. The core latch and lower-hinge service numbers differ, so the evidence must be described as functional/component-class similarity—not exact latch/hinge identity and not ADR 2/01 compliance.</w:t>
       </w:r>
     </w:p>
     <w:p>

</xml_diff>